<commit_message>
docs(naskah): selaraskan class diagram shi.docx dengan diagram baru
Diagram baru pakai nama kelas Bahasa Indonesia (Klien, Proyek,
PenugasanProyek, KesehatanProyek, Tugas, BuktiTugas, Eskalasi)
dan role enum hanya technician|manager. Penjelasan + tabel relasi
diregenerasi mengikuti drawio/classdiagram_new.drawio.

Co-Authored-By: Claude Opus 4.7 (1M context) <noreply@anthropic.com>
</commit_message>
<xml_diff>
--- a/naskah/class diagram shi.docx
+++ b/naskah/class diagram shi.docx
@@ -39,7 +39,7 @@
         <w:pStyle w:val="ParagrafNew"/>
       </w:pPr>
       <w:r>
-        <w:t>Kelas User (pengguna) berfungsi sebagai lapisan autentikasi dan otorisasi pada sistem. Kelas ini merepresentasikan entitas pengguna serta mengelola hak akses berdasarkan peran yang dimiliki, yaitu technician, manager, atau admin. Deskripsi fungsi pada kelas User dapat dilihat pada Tabel 4.1.</w:t>
+        <w:t>Kelas User (pengguna) berfungsi sebagai lapisan autentikasi dan otorisasi pada sistem. Kelas ini merepresentasikan entitas pengguna serta mengelola hak akses berdasarkan peran yang dimiliki, yaitu technician dan manager. Deskripsi fungsi pada kelas User dapat dilihat pada Tabel 4.1.</w:t>
       </w:r>
     </w:p>
     <w:p>
@@ -163,7 +163,7 @@
         <w:pStyle w:val="431n"/>
       </w:pPr>
       <w:r>
-        <w:t>Kelas Client</w:t>
+        <w:t>Kelas Klien</w:t>
       </w:r>
     </w:p>
     <w:p>
@@ -171,7 +171,7 @@
         <w:pStyle w:val="ParagrafNew"/>
       </w:pPr>
       <w:r>
-        <w:t>Kelas Client (klien) merepresentasikan entitas pelanggan atau instansi pemilik proyek. Kelas ini digunakan untuk mengelola data klien yang terdaftar dalam sistem sehingga proyek selalu memiliki pihak penanggung jawab eksternal yang jelas. Deskripsi fungsi pada kelas Client dapat dilihat pada Tabel 4.2.</w:t>
+        <w:t>Kelas Klien merepresentasikan entitas pelanggan atau instansi pemilik proyek. Kelas ini digunakan untuk mengelola data klien yang terdaftar dalam sistem sehingga proyek selalu memiliki pihak penanggung jawab eksternal yang jelas. Deskripsi fungsi pada kelas Klien dapat dilihat pada Tabel 4.2.</w:t>
       </w:r>
     </w:p>
     <w:p>
@@ -179,7 +179,7 @@
         <w:pStyle w:val="DaftarTabel"/>
       </w:pPr>
       <w:r>
-        <w:t>Tabel 4.2 Kelas Client</w:t>
+        <w:t>Tabel 4.2 Kelas Klien</w:t>
       </w:r>
     </w:p>
     <w:tbl>
@@ -327,7 +327,7 @@
         <w:pStyle w:val="431n"/>
       </w:pPr>
       <w:r>
-        <w:t>Kelas Project</w:t>
+        <w:t>Kelas Proyek</w:t>
       </w:r>
     </w:p>
     <w:p>
@@ -335,7 +335,7 @@
         <w:pStyle w:val="ParagrafNew"/>
       </w:pPr>
       <w:r>
-        <w:t>Kelas Project (proyek) merupakan inti utama sistem karena berfungsi untuk mengelola koordinasi proyek, penjadwalan, fase pekerjaan, serta hubungan antar tugas. Kelas ini juga menjadi titik integrasi antara data klien, pengguna, tugas, hingga indikator kesehatan proyek. Deskripsi fungsi pada kelas Project dapat dilihat pada Tabel 4.3.</w:t>
+        <w:t>Kelas Proyek merupakan inti utama sistem karena berfungsi untuk mengelola koordinasi proyek, penjadwalan, fase pekerjaan, serta hubungan antar tugas. Kelas ini juga menjadi titik integrasi antara data klien, pengguna, tugas, hingga indikator kesehatan proyek. Deskripsi fungsi pada kelas Proyek dapat dilihat pada Tabel 4.3.</w:t>
       </w:r>
     </w:p>
     <w:p>
@@ -343,7 +343,7 @@
         <w:pStyle w:val="DaftarTabel"/>
       </w:pPr>
       <w:r>
-        <w:t>Tabel 4.3 Kelas Project</w:t>
+        <w:t>Tabel 4.3 Kelas Proyek</w:t>
       </w:r>
     </w:p>
     <w:tbl>
@@ -608,7 +608,7 @@
           </w:tcPr>
           <w:p>
             <w:r>
-              <w:t>Mengambil informasi indikator kesehatan proyek dari kelas ProjectHealth.</w:t>
+              <w:t>Mengambil informasi indikator kesehatan proyek dari kelas KesehatanProyek.</w:t>
             </w:r>
           </w:p>
         </w:tc>
@@ -619,7 +619,7 @@
         <w:pStyle w:val="431n"/>
       </w:pPr>
       <w:r>
-        <w:t>Kelas ProjectAssignment</w:t>
+        <w:t>Kelas PenugasanProyek</w:t>
       </w:r>
     </w:p>
     <w:p>
@@ -627,7 +627,7 @@
         <w:pStyle w:val="ParagrafNew"/>
       </w:pPr>
       <w:r>
-        <w:t>Kelas ProjectAssignment (penugasan proyek) berfungsi sebagai kelas asosiasi yang menghubungkan pengguna dengan proyek tertentu secara terstruktur. Kelas ini mencatat siapa yang ditugaskan pada proyek tertentu dan kapan penugasan tersebut dilakukan. Deskripsi fungsi pada kelas ProjectAssignment dapat dilihat pada Tabel 4.4.</w:t>
+        <w:t>Kelas PenugasanProyek berfungsi sebagai kelas asosiasi yang menghubungkan pengguna dengan proyek tertentu secara terstruktur. Kelas ini mencatat siapa yang ditugaskan pada proyek tertentu dan kapan penugasan tersebut dilakukan. Deskripsi fungsi pada kelas PenugasanProyek dapat dilihat pada Tabel 4.4.</w:t>
       </w:r>
     </w:p>
     <w:p>
@@ -635,7 +635,7 @@
         <w:pStyle w:val="DaftarTabel"/>
       </w:pPr>
       <w:r>
-        <w:t>Tabel 4.4 Kelas ProjectAssignment</w:t>
+        <w:t>Tabel 4.4 Kelas PenugasanProyek</w:t>
       </w:r>
     </w:p>
     <w:tbl>
@@ -783,7 +783,7 @@
         <w:pStyle w:val="431n"/>
       </w:pPr>
       <w:r>
-        <w:t>Kelas ProjectHealth</w:t>
+        <w:t>Kelas KesehatanProyek</w:t>
       </w:r>
     </w:p>
     <w:p>
@@ -791,7 +791,7 @@
         <w:pStyle w:val="ParagrafNew"/>
       </w:pPr>
       <w:r>
-        <w:t>Kelas ProjectHealth (kesehatan proyek) berfungsi untuk mengelola proses komputasi EWS serta menghitung indikator kesehatan proyek. Dengan adanya pemisahan ini, perhitungan SPI, Earned Value, dan Planned Value dijaga konsistensinya dan tidak bercampur dengan logika pengelolaan proyek itu sendiri. Deskripsi fungsi pada kelas ProjectHealth dapat dilihat pada Tabel 4.5.</w:t>
+        <w:t>Kelas KesehatanProyek berfungsi untuk mengelola proses komputasi EWS serta menghitung indikator kesehatan proyek. Dengan adanya pemisahan ini, perhitungan SPI, Earned Value, dan Planned Value dijaga konsistensinya dan tidak bercampur dengan logika pengelolaan proyek itu sendiri. Deskripsi fungsi pada kelas KesehatanProyek dapat dilihat pada Tabel 4.5.</w:t>
       </w:r>
     </w:p>
     <w:p>
@@ -799,7 +799,7 @@
         <w:pStyle w:val="DaftarTabel"/>
       </w:pPr>
       <w:r>
-        <w:t>Tabel 4.5 Kelas ProjectHealth</w:t>
+        <w:t>Tabel 4.5 Kelas KesehatanProyek</w:t>
       </w:r>
     </w:p>
     <w:tbl>
@@ -1011,7 +1011,7 @@
         <w:pStyle w:val="431n"/>
       </w:pPr>
       <w:r>
-        <w:t>Kelas Task</w:t>
+        <w:t>Kelas Tugas</w:t>
       </w:r>
     </w:p>
     <w:p>
@@ -1019,7 +1019,7 @@
         <w:pStyle w:val="ParagrafNew"/>
       </w:pPr>
       <w:r>
-        <w:t>Kelas Task (tugas) merepresentasikan unit pekerjaan atau tugas lapangan yang harus diselesaikan dalam periode waktu tertentu. Kelas ini menjadi titik utama interaksi teknisi dengan sistem sekaligus sumber utama data perhitungan SPI. Deskripsi fungsi pada kelas Task dapat dilihat pada Tabel 4.6.</w:t>
+        <w:t>Kelas Tugas merepresentasikan unit pekerjaan atau tugas lapangan yang harus diselesaikan dalam periode waktu tertentu. Kelas ini menjadi titik utama interaksi teknisi dengan sistem sekaligus sumber utama data perhitungan SPI. Deskripsi fungsi pada kelas Tugas dapat dilihat pada Tabel 4.6.</w:t>
       </w:r>
     </w:p>
     <w:p>
@@ -1027,7 +1027,7 @@
         <w:pStyle w:val="DaftarTabel"/>
       </w:pPr>
       <w:r>
-        <w:t>Tabel 4.6 Kelas Task</w:t>
+        <w:t>Tabel 4.6 Kelas Tugas</w:t>
       </w:r>
     </w:p>
     <w:tbl>
@@ -1303,7 +1303,7 @@
         <w:pStyle w:val="431n"/>
       </w:pPr>
       <w:r>
-        <w:t>Kelas TaskEvidence</w:t>
+        <w:t>Kelas BuktiTugas</w:t>
       </w:r>
     </w:p>
     <w:p>
@@ -1311,7 +1311,7 @@
         <w:pStyle w:val="ParagrafNew"/>
       </w:pPr>
       <w:r>
-        <w:t>Kelas TaskEvidence (bukti) digunakan untuk mengelola dokumen atau lampiran bukti pekerjaan yang dikirimkan oleh teknisi. Kelas ini menjamin bahwa setiap tugas yang dilaporkan dapat diverifikasi melalui dokumentasi pendukung. Deskripsi fungsi pada kelas TaskEvidence dapat dilihat pada Tabel 4.7.</w:t>
+        <w:t>Kelas BuktiTugas digunakan untuk mengelola dokumen atau lampiran bukti pekerjaan yang dikirimkan oleh teknisi. Kelas ini menjamin bahwa setiap tugas yang dilaporkan dapat diverifikasi melalui dokumentasi pendukung. Deskripsi fungsi pada kelas BuktiTugas dapat dilihat pada Tabel 4.7.</w:t>
       </w:r>
     </w:p>
     <w:p>
@@ -1319,7 +1319,7 @@
         <w:pStyle w:val="DaftarTabel"/>
       </w:pPr>
       <w:r>
-        <w:t>Tabel 4.7 Kelas TaskEvidence</w:t>
+        <w:t>Tabel 4.7 Kelas BuktiTugas</w:t>
       </w:r>
     </w:p>
     <w:tbl>
@@ -1467,7 +1467,7 @@
         <w:pStyle w:val="431n"/>
       </w:pPr>
       <w:r>
-        <w:t>Kelas Escalation</w:t>
+        <w:t>Kelas Eskalasi</w:t>
       </w:r>
     </w:p>
     <w:p>
@@ -1475,7 +1475,7 @@
         <w:pStyle w:val="ParagrafNew"/>
       </w:pPr>
       <w:r>
-        <w:t>Kelas Escalation (eskalasi) berfungsi untuk mencatat, mengelola prioritas, dan memantau proses komunikasi terkait kendala lapangan yang terjadi selama pelaksanaan proyek. Kelas ini memastikan setiap hambatan tercatat secara formal dan dapat ditindaklanjuti oleh manajer. Deskripsi fungsi pada kelas Escalation dapat dilihat pada Tabel 4.8.</w:t>
+        <w:t>Kelas Eskalasi berfungsi untuk mencatat, mengelola prioritas, dan memantau proses komunikasi terkait kendala lapangan yang terjadi selama pelaksanaan proyek. Kelas ini memastikan setiap hambatan tercatat secara formal dan dapat ditindaklanjuti oleh manajer. Deskripsi fungsi pada kelas Eskalasi dapat dilihat pada Tabel 4.8.</w:t>
       </w:r>
     </w:p>
     <w:p>
@@ -1483,7 +1483,7 @@
         <w:pStyle w:val="DaftarTabel"/>
       </w:pPr>
       <w:r>
-        <w:t>Tabel 4.8 Kelas Escalation</w:t>
+        <w:t>Tabel 4.8 Kelas Eskalasi</w:t>
       </w:r>
     </w:p>
     <w:tbl>
@@ -1784,7 +1784,7 @@
           </w:tcPr>
           <w:p>
             <w:r>
-              <w:t>ProjectAssignment</w:t>
+              <w:t>PenugasanProyek</w:t>
             </w:r>
           </w:p>
         </w:tc>
@@ -1816,7 +1816,7 @@
           </w:tcPr>
           <w:p>
             <w:r>
-              <w:t>Client</w:t>
+              <w:t>Klien</w:t>
             </w:r>
           </w:p>
         </w:tc>
@@ -1836,7 +1836,7 @@
           </w:tcPr>
           <w:p>
             <w:r>
-              <w:t>Project</w:t>
+              <w:t>Proyek</w:t>
             </w:r>
           </w:p>
         </w:tc>
@@ -1868,7 +1868,7 @@
           </w:tcPr>
           <w:p>
             <w:r>
-              <w:t>Project</w:t>
+              <w:t>Proyek</w:t>
             </w:r>
           </w:p>
         </w:tc>
@@ -1888,7 +1888,7 @@
           </w:tcPr>
           <w:p>
             <w:r>
-              <w:t>ProjectAssignment</w:t>
+              <w:t>PenugasanProyek</w:t>
             </w:r>
           </w:p>
         </w:tc>
@@ -1920,7 +1920,7 @@
           </w:tcPr>
           <w:p>
             <w:r>
-              <w:t>Project</w:t>
+              <w:t>Proyek</w:t>
             </w:r>
           </w:p>
         </w:tc>
@@ -1940,7 +1940,7 @@
           </w:tcPr>
           <w:p>
             <w:r>
-              <w:t>ProjectHealth</w:t>
+              <w:t>KesehatanProyek</w:t>
             </w:r>
           </w:p>
         </w:tc>
@@ -1972,7 +1972,7 @@
           </w:tcPr>
           <w:p>
             <w:r>
-              <w:t>Project</w:t>
+              <w:t>Proyek</w:t>
             </w:r>
           </w:p>
         </w:tc>
@@ -1992,7 +1992,7 @@
           </w:tcPr>
           <w:p>
             <w:r>
-              <w:t>Task</w:t>
+              <w:t>Tugas</w:t>
             </w:r>
           </w:p>
         </w:tc>
@@ -2024,7 +2024,7 @@
           </w:tcPr>
           <w:p>
             <w:r>
-              <w:t>Task</w:t>
+              <w:t>Tugas</w:t>
             </w:r>
           </w:p>
         </w:tc>
@@ -2044,7 +2044,7 @@
           </w:tcPr>
           <w:p>
             <w:r>
-              <w:t>TaskEvidence</w:t>
+              <w:t>BuktiTugas</w:t>
             </w:r>
           </w:p>
         </w:tc>
@@ -2076,7 +2076,7 @@
           </w:tcPr>
           <w:p>
             <w:r>
-              <w:t>Task</w:t>
+              <w:t>Tugas</w:t>
             </w:r>
           </w:p>
         </w:tc>
@@ -2096,7 +2096,7 @@
           </w:tcPr>
           <w:p>
             <w:r>
-              <w:t>Escalation</w:t>
+              <w:t>Eskalasi</w:t>
             </w:r>
           </w:p>
         </w:tc>
@@ -2148,7 +2148,7 @@
           </w:tcPr>
           <w:p>
             <w:r>
-              <w:t>Task</w:t>
+              <w:t>Tugas</w:t>
             </w:r>
           </w:p>
         </w:tc>

</xml_diff>